<commit_message>
portfolio update: sync latest resume, remove algorithm showcase wording
</commit_message>
<xml_diff>
--- a/files/黄彦飞_策划求职简历.docx
+++ b/files/黄彦飞_策划求职简历.docx
@@ -60,7 +60,7 @@
           <w:spacing w:val="6"/>
           <w:lang w:val="en-US" w:eastAsia="zh-CN"/>
         </w:rPr>
-        <w:t>电话：【19950737950】            邮箱：【1051613282@qq.com】</w:t>
+        <w:t>电话：19950737950            邮箱：1051613282@qq.com</w:t>
       </w:r>
     </w:p>
     <w:p>
@@ -105,7 +105,7 @@
           <w:u w:val="none"/>
           <w:lang w:val="en-US" w:eastAsia="zh-CN"/>
         </w:rPr>
-        <w:t>出生年月：【2002.12】   性别：男</w:t>
+        <w:t>出生年月：2002.12   性别：男</w:t>
       </w:r>
     </w:p>
     <w:p>
@@ -434,7 +434,7 @@
           <w:sz w:val="18"/>
           <w:lang w:val="en-US" w:eastAsia="zh-CN"/>
         </w:rPr>
-        <w:t>游戏引擎和编程：计算机专业背景，具备 C# 基础与Python数据脚本能力，能独立编写数值模拟脚本，作品集中的40万次蒙特卡洛抽卡模拟即由本人独立实现</w:t>
+        <w:t>游戏引擎和编程：计算机专业背景，具备 C# 基础与Python数据脚本能力，能独立编写数值模拟脚本，作品集中的概率与保底数值校验即由本人独立完成</w:t>
       </w:r>
     </w:p>
     <w:p>
@@ -676,7 +676,7 @@
           <w:sz w:val="18"/>
           <w:lang w:val="en-US" w:eastAsia="zh-CN"/>
         </w:rPr>
-        <w:t>数据和运营：掌握蒙特卡洛模拟、端点反推等分析方法，理解留存、付费率、LTV 等核心运营指标的口径与用途</w:t>
+        <w:t>数据和运营：掌握数值模拟、端点反推等分析方法，理解留存、付费率、LTV 等核心运营指标的口径与用途</w:t>
       </w:r>
     </w:p>
     <w:p>
@@ -819,7 +819,7 @@
           <w:szCs w:val="18"/>
           <w:lang w:eastAsia="zh-CN"/>
         </w:rPr>
-        <w:t>2.用 Python 独立实现蒙特卡洛模型，40 万次抽样验证概率与软保底参数区间，将拆解从规则复述推进到数值验证；</w:t>
+        <w:t>2.用 Python 建立数值模型，对概率与软保底参数区间做系统校验，将拆解从规则复述推进到数值验证；</w:t>
       </w:r>
       <w:r>
         <w:rPr>
@@ -1144,7 +1144,7 @@
           <w:szCs w:val="18"/>
           <w:lang w:val="en-US" w:eastAsia="zh-CN"/>
         </w:rPr>
-        <w:t>作品集链接：【待填：网盘/在线文档链接】</w:t>
+        <w:t>作品集链接：https://helloworld33available.github.io/hyf-portfolio/</w:t>
       </w:r>
     </w:p>
     <w:p>

</xml_diff>

<commit_message>
portfolio update: swap resume e7 entry to payment analysis
</commit_message>
<xml_diff>
--- a/files/黄彦飞_策划求职简历.docx
+++ b/files/黄彦飞_策划求职简历.docx
@@ -478,7 +478,7 @@
         <w:rPr>
           <w:sz w:val="18"/>
         </w:rPr>
-        <w:t>拆解能力：完成星铁付费系统、第七史诗经济系统、绿洲启元玩法三份拆解案，沉淀出「端点反推」分析方法</w:t>
+        <w:t>拆解能力：完成星铁付费系统、第七史诗付费系统、绿洲启元玩法三份拆解案，沉淀出「端点反推」分析方法</w:t>
       </w:r>
     </w:p>
     <w:p>
@@ -968,7 +968,7 @@
           <w:szCs w:val="18"/>
           <w:lang w:eastAsia="zh-CN"/>
         </w:rPr>
-        <w:t>《第七史诗》经济系统拆解案      独立完成      2026年09月 – 2026年10月</w:t>
+        <w:t>《第七史诗》付费系统拆解案      独立完成      2026年10月</w:t>
       </w:r>
     </w:p>
     <w:p>
@@ -991,7 +991,7 @@
           <w:szCs w:val="18"/>
           <w:lang w:eastAsia="zh-CN"/>
         </w:rPr>
-        <w:t>项目描述：拆解该作经济系统的货币层级、资源闭环与数值控制逻辑。</w:t>
+        <w:t>项目描述：拆解该作商城的付费结构：按结算货币划分四轨商店，覆盖限时礼包、常驻直购、凭证兑换与订阅四类付费模块。</w:t>
       </w:r>
       <w:r>
         <w:rPr>

</xml_diff>

<commit_message>
portfolio update: apply resume coaching feedback (header, skills rework, project outcomes, game table)
</commit_message>
<xml_diff>
--- a/files/黄彦飞_策划求职简历.docx
+++ b/files/黄彦飞_策划求职简历.docx
@@ -105,7 +105,7 @@
           <w:u w:val="none"/>
           <w:lang w:val="en-US" w:eastAsia="zh-CN"/>
         </w:rPr>
-        <w:t>出生年月：2002.12   性别：男</w:t>
+        <w:t>出生年月：2002.12（23岁）   性别：男</w:t>
       </w:r>
     </w:p>
     <w:p>
@@ -139,6 +139,27 @@
           <w:lang w:val="en-US" w:eastAsia="zh-CN"/>
         </w:rPr>
         <w:t>求职意向：系统策划         期望薪资：8k-12k</w:t>
+      </w:r>
+    </w:p>
+    <w:p>
+      <w:pPr>
+        <w:pStyle w:val="3"/>
+        <w:tabs>
+          <w:tab w:val="left" w:pos="1768"/>
+        </w:tabs>
+        <w:spacing w:before="0" w:line="304" w:lineRule="exact"/>
+        <w:ind w:left="0" w:leftChars="0" w:firstLine="0" w:firstLineChars="0"/>
+        <w:jc w:val="left"/>
+        <w:rPr>
+          <w:rFonts w:hint="default"/>
+          <w:lang w:val="en-US" w:eastAsia="zh-CN"/>
+        </w:rPr>
+      </w:pPr>
+      <w:r>
+        <w:rPr>
+          <w:b w:val="0"/>
+        </w:rPr>
+        <w:t>个人主页：https://helloworld33available.github.io/hyf-portfolio/</w:t>
       </w:r>
     </w:p>
     <w:p>
@@ -769,13 +790,37 @@
         <w:rPr>
           <w:lang w:eastAsia="zh-CN"/>
         </w:rPr>
-        <w:br w:type="textWrapping"/>
-      </w:r>
-      <w:r>
-        <w:rPr>
-          <w:lang w:eastAsia="zh-CN"/>
-        </w:rPr>
-        <w:t>行业认知：熟悉商业游戏研发全流程与系统设计方法，对卡牌、回合制 RPG、SLG、开放世界等品类的商业化与长线运营有系统认知</w:t>
+      </w:r>
+      <w:r>
+        <w:rPr>
+          <w:lang w:eastAsia="zh-CN"/>
+        </w:rPr>
+      </w:r>
+    </w:p>
+    <w:p>
+      <w:pPr>
+        <w:numPr>
+          <w:ilvl w:val="0"/>
+          <w:numId w:val="0"/>
+        </w:numPr>
+        <w:spacing w:line="317" w:lineRule="exact"/>
+        <w:ind w:leftChars="0"/>
+        <w:jc w:val="left"/>
+        <w:rPr>
+          <w:sz w:val="18"/>
+        </w:rPr>
+      </w:pPr>
+      <w:r>
+        <w:rPr>
+          <w:b/>
+        </w:rPr>
+        <w:t>行业认知：</w:t>
+      </w:r>
+      <w:r>
+        <w:rPr>
+          <w:b w:val="0"/>
+        </w:rPr>
+        <w:t>熟悉商业游戏研发全流程与系统设计方法，对卡牌、回合制 RPG、SLG、开放世界等品类的商业化与长线运营有系统认知</w:t>
       </w:r>
     </w:p>
     <w:p>
@@ -793,11 +838,15 @@
       </w:pPr>
       <w:r>
         <w:rPr>
-          <w:rFonts w:hint="eastAsia"/>
-          <w:sz w:val="18"/>
-          <w:lang w:val="en-US" w:eastAsia="zh-CN"/>
-        </w:rPr>
-        <w:t>游戏引擎和编程：计算机专业背景，具备 C# 基础与Python数据脚本能力，能独立编写数值模拟脚本，作品集中的概率与保底数值校验即由本人独立完成</w:t>
+          <w:b/>
+        </w:rPr>
+        <w:t>游戏引擎：</w:t>
+      </w:r>
+      <w:r>
+        <w:rPr>
+          <w:b w:val="0"/>
+        </w:rPr>
+        <w:t>Unity 基础，能独立完成可玩原型搭建，作品集含塔防、卡牌 Roguelike、三消三款 Unity Demo</w:t>
       </w:r>
     </w:p>
     <w:p>
@@ -815,98 +864,48 @@
       </w:pPr>
       <w:r>
         <w:rPr>
-          <w:sz w:val="18"/>
-        </w:rPr>
-        <w:t>策划能力部分：</w:t>
-      </w:r>
-      <w:r>
-        <w:rPr>
-          <w:sz w:val="18"/>
-        </w:rPr>
-        <w:br w:type="textWrapping"/>
-      </w:r>
-      <w:r>
-        <w:rPr>
-          <w:sz w:val="18"/>
-        </w:rPr>
-        <w:t>设计能力：独立完成《崩坏：星穹铁道》跃迁系统策划案，覆盖抽卡全链路规则、边界校验表与13张界面示意图</w:t>
-      </w:r>
-      <w:r>
-        <w:rPr>
-          <w:sz w:val="18"/>
-        </w:rPr>
-        <w:br w:type="textWrapping"/>
-      </w:r>
-      <w:r>
-        <w:rPr>
-          <w:sz w:val="18"/>
-        </w:rPr>
-        <w:t>拆解能力：完成星铁付费系统、第七史诗付费系统、绿洲启元玩法三份拆解案，沉淀出「端点反推」分析方法</w:t>
+          <w:b/>
+        </w:rPr>
+        <w:t>编程语言：</w:t>
+      </w:r>
+      <w:r>
+        <w:rPr>
+          <w:b w:val="0"/>
+        </w:rPr>
+        <w:t>C# 基础与 Python 数据脚本能力，能独立编写数值模拟脚本，作品集中的概率与保底数值校验即由本人独立完成</w:t>
       </w:r>
     </w:p>
     <w:p>
       <w:pPr>
         <w:numPr>
           <w:ilvl w:val="0"/>
-          <w:numId w:val="2"/>
+          <w:numId w:val="1"/>
         </w:numPr>
         <w:spacing w:line="317" w:lineRule="exact"/>
+        <w:ind w:leftChars="0"/>
         <w:jc w:val="left"/>
         <w:rPr>
-          <w:rFonts w:hint="eastAsia"/>
-          <w:sz w:val="18"/>
-          <w:lang w:val="en-US" w:eastAsia="zh-CN"/>
-        </w:rPr>
-      </w:pPr>
-      <w:r>
-        <w:rPr>
-          <w:rFonts w:hint="eastAsia"/>
-          <w:sz w:val="18"/>
-          <w:lang w:val="en-US" w:eastAsia="zh-CN"/>
-        </w:rPr>
-        <w:t>设计能力+表现设计</w:t>
-      </w:r>
-    </w:p>
-    <w:p>
-      <w:pPr>
-        <w:numPr>
-          <w:ilvl w:val="0"/>
-          <w:numId w:val="2"/>
-        </w:numPr>
-        <w:spacing w:line="317" w:lineRule="exact"/>
-        <w:jc w:val="left"/>
-        <w:rPr>
-          <w:sz w:val="18"/>
-        </w:rPr>
-      </w:pPr>
-      <w:r>
-        <w:rPr>
-          <w:rFonts w:hint="eastAsia"/>
-          <w:sz w:val="18"/>
-          <w:lang w:val="en-US" w:eastAsia="zh-CN"/>
-        </w:rPr>
-        <w:t>拆解能力+竞品分析</w:t>
-      </w:r>
-    </w:p>
-    <w:p>
-      <w:pPr>
-        <w:numPr>
-          <w:ilvl w:val="0"/>
-          <w:numId w:val="2"/>
-        </w:numPr>
-        <w:spacing w:line="317" w:lineRule="exact"/>
-        <w:jc w:val="left"/>
-        <w:rPr>
-          <w:sz w:val="18"/>
-        </w:rPr>
-      </w:pPr>
-      <w:r>
-        <w:rPr>
-          <w:rFonts w:hint="eastAsia"/>
-          <w:sz w:val="18"/>
-          <w:lang w:val="en-US" w:eastAsia="zh-CN"/>
-        </w:rPr>
-        <w:t>工具部分：</w:t>
+          <w:sz w:val="18"/>
+        </w:rPr>
+      </w:pPr>
+      <w:r>
+        <w:rPr>
+          <w:b/>
+        </w:rPr>
+        <w:t>策划能力：</w:t>
+      </w:r>
+      <w:r>
+        <w:rPr>
+          <w:b w:val="0"/>
+        </w:rPr>
+        <w:t>设计能力：独立完成《崩坏：星穹铁道》跃迁系统策划案，覆盖抽卡全链路规则、边界校验表与13张界面示意图</w:t>
+        <w:br/>
+      </w:r>
+      <w:r>
+        <w:rPr>
+          <w:b w:val="0"/>
+        </w:rPr>
+        <w:t>拆解能力：完成星铁付费系统、第七史诗付费系统、绿洲启元玩法三份拆解案</w:t>
       </w:r>
     </w:p>
     <w:p>
@@ -925,11 +924,15 @@
       </w:pPr>
       <w:r>
         <w:rPr>
-          <w:rFonts w:hint="eastAsia"/>
-          <w:sz w:val="18"/>
-          <w:lang w:val="en-US" w:eastAsia="zh-CN"/>
-        </w:rPr>
-        <w:t>1、策划工具：Office 三件套（Word/Excel/PPT），熟悉需求文档与配置表的规范写法</w:t>
+          <w:b/>
+        </w:rPr>
+        <w:t>策划工具：</w:t>
+      </w:r>
+      <w:r>
+        <w:rPr>
+          <w:b w:val="0"/>
+        </w:rPr>
+        <w:t>Office 三件套（Word/Excel/PPT）、Axure（原型图）、XMind（思维导图），熟悉需求文档与配置表的规范写法</w:t>
       </w:r>
     </w:p>
     <w:p>
@@ -941,18 +944,22 @@
         <w:spacing w:line="317" w:lineRule="exact"/>
         <w:jc w:val="left"/>
         <w:rPr>
-          <w:rFonts w:hint="default"/>
+          <w:rFonts w:hint="eastAsia"/>
           <w:sz w:val="18"/>
           <w:lang w:val="en-US" w:eastAsia="zh-CN"/>
         </w:rPr>
       </w:pPr>
       <w:r>
         <w:rPr>
-          <w:rFonts w:hint="eastAsia"/>
-          <w:sz w:val="18"/>
-          <w:lang w:val="en-US" w:eastAsia="zh-CN"/>
-        </w:rPr>
-        <w:t>2、美术工具：具备基础图像处理能力，能用脚本绘制界面示意图与流程图</w:t>
+          <w:b/>
+        </w:rPr>
+        <w:t>AI 工具：</w:t>
+      </w:r>
+      <w:r>
+        <w:rPr>
+          <w:b w:val="0"/>
+        </w:rPr>
+        <w:t>熟练运用 AI Agent 辅助策划工作（资料检索、数据核查、文档生成与流程自动化），并能用 AI 生成界面示意图与流程图，支撑多份作品集的产出</w:t>
       </w:r>
     </w:p>
     <w:p>
@@ -964,18 +971,20 @@
         <w:spacing w:line="317" w:lineRule="exact"/>
         <w:jc w:val="left"/>
         <w:rPr>
-          <w:rFonts w:hint="eastAsia"/>
-          <w:sz w:val="18"/>
-          <w:lang w:val="en-US" w:eastAsia="zh-CN"/>
-        </w:rPr>
-      </w:pPr>
-      <w:r>
-        <w:rPr>
-          <w:rFonts w:hint="eastAsia"/>
-          <w:sz w:val="18"/>
-          <w:lang w:val="en-US" w:eastAsia="zh-CN"/>
-        </w:rPr>
-        <w:t>3、AI 工具：熟练运用 AI Agent 辅助策划工作（资料检索、数据核查、文档生成与流程自动化），并以该工作流支撑多份作品集的产出</w:t>
+          <w:sz w:val="18"/>
+        </w:rPr>
+      </w:pPr>
+      <w:r>
+        <w:rPr>
+          <w:b/>
+        </w:rPr>
+        <w:t>文化底蕴：</w:t>
+      </w:r>
+      <w:r>
+        <w:rPr>
+          <w:b w:val="0"/>
+        </w:rPr>
+        <w:t>二次元品类长期深度体验（星铁、第七史诗），对武侠与仙侠题材有持续涉猎，便于参与国风题材的系统与叙事设计</w:t>
       </w:r>
     </w:p>
     <w:p>
@@ -993,26 +1002,14 @@
       <w:r>
         <w:rPr>
           <w:b/>
-          <w:bCs/>
-          <w:sz w:val="18"/>
-        </w:rPr>
-        <w:t>文化底蕴部分：二次元品类长期深度体验（星铁、第七史诗），对武侠与仙侠题材有持续涉猎</w:t>
-      </w:r>
-      <w:r>
-        <w:rPr>
-          <w:b/>
-          <w:bCs/>
-          <w:sz w:val="18"/>
-        </w:rPr>
-        <w:br w:type="textWrapping"/>
-      </w:r>
-      <w:r>
-        <w:rPr>
-          <w:b/>
-          <w:bCs/>
-          <w:sz w:val="18"/>
-        </w:rPr>
-        <w:t>素质能力部分：写作能力强（多份万字级拆解案），概率与数值计算扎实，审美在线</w:t>
+        </w:rPr>
+        <w:t>素质能力：</w:t>
+      </w:r>
+      <w:r>
+        <w:rPr>
+          <w:b w:val="0"/>
+        </w:rPr>
+        <w:t>写作能力强（多份万字级拆解案），概率与数值计算扎实，审美在线</w:t>
       </w:r>
     </w:p>
     <w:p>
@@ -1204,6 +1201,12 @@
         </w:rPr>
         <w:t>3.输出期望成本曲线与四类玩家付费路径分析。</w:t>
       </w:r>
+      <w:r>
+        <w:br/>
+        <w:t>项目成果：沉淀出可复用的商业化系统拆解框架，覆盖兑换比例、保底结构、五层用户资源比较与账号保值分析。</w:t>
+        <w:br/>
+        <w:t>作品链接：https://helloworld33available.github.io/hyf-portfolio/works/hsr-payment-analysis.html</w:t>
+      </w:r>
     </w:p>
     <w:p>
       <w:pPr>
@@ -1310,6 +1313,12 @@
         </w:rPr>
         <w:t>2.完成 13 张界面示意图与完整目录，形成可直接评审的成体系策划案。</w:t>
       </w:r>
+      <w:r>
+        <w:br/>
+        <w:t>项目成果：形成从边界规则到参数校验闭环的完整原创策划案，并与实习期的卡牌抽卡系统经验互相印证，验证方法论的可迁移性。</w:t>
+        <w:br/>
+        <w:t>作品链接：https://helloworld33available.github.io/hyf-portfolio/works/hsr-warp-design.html</w:t>
+      </w:r>
     </w:p>
     <w:p>
       <w:pPr>
@@ -1416,6 +1425,12 @@
         </w:rPr>
         <w:t>2.以 121 抽硬保底为基准演算各层用户锁定限定角色的周期，沉淀商城分轨与分层定价的可复用方法。</w:t>
       </w:r>
+      <w:r>
+        <w:br/>
+        <w:t>项目成果：沉淀商城分轨与分层定价的可复用拆解方法，可直接迁移至其他卡牌 / 二次元品类的商业化分析。</w:t>
+        <w:br/>
+        <w:t>作品链接：https://helloworld33available.github.io/hyf-portfolio/works/e7-payment-analysis.html</w:t>
+      </w:r>
     </w:p>
     <w:p>
       <w:pPr>
@@ -1481,6 +1496,12 @@
           <w:lang w:eastAsia="zh-CN"/>
         </w:rPr>
         <w:t>负责内容：完成玩法规则拆解与体验分析，输出完整拆解文档。</w:t>
+      </w:r>
+      <w:r>
+        <w:br/>
+        <w:t>项目成果：输出完整的 UGC 玩法拆解文档，验证拆解方法在 UGC 品类的泛化能力。</w:t>
+        <w:br/>
+        <w:t>作品链接：https://helloworld33available.github.io/hyf-portfolio/works/oasis-xiuxian-analysis.html</w:t>
       </w:r>
     </w:p>
     <w:p>
@@ -1507,7 +1528,7 @@
           <w:szCs w:val="18"/>
           <w:lang w:val="en-US" w:eastAsia="zh-CN"/>
         </w:rPr>
-        <w:t>作品集链接：https://helloworld33available.github.io/hyf-portfolio/</w:t>
+        <w:t>个人主页（含全部作品与游戏经历）：https://helloworld33available.github.io/hyf-portfolio/</w:t>
       </w:r>
     </w:p>
     <w:p>
@@ -1716,7 +1737,7 @@
                 <w:rFonts w:ascii="宋体" w:hAnsi="宋体" w:eastAsia="宋体"/>
                 <w:sz w:val="18"/>
               </w:rPr>
-              <w:t>游戏平台</w:t>
+              <w:t>游戏类型</w:t>
             </w:r>
           </w:p>
         </w:tc>
@@ -1734,7 +1755,7 @@
                 <w:rFonts w:ascii="宋体" w:hAnsi="宋体" w:eastAsia="宋体"/>
                 <w:sz w:val="18"/>
               </w:rPr>
-              <w:t>游戏类型</w:t>
+              <w:t>游戏名称</w:t>
             </w:r>
           </w:p>
         </w:tc>
@@ -1752,24 +1773,6 @@
                 <w:rFonts w:ascii="宋体" w:hAnsi="宋体" w:eastAsia="宋体"/>
                 <w:sz w:val="18"/>
               </w:rPr>
-              <w:t>游戏名称</w:t>
-            </w:r>
-          </w:p>
-        </w:tc>
-        <w:tc>
-          <w:tcPr>
-            <w:tcW w:w="1626" w:type="dxa"/>
-            <w:vAlign w:val="center"/>
-          </w:tcPr>
-          <w:p>
-            <w:pPr>
-              <w:jc w:val="both"/>
-            </w:pPr>
-            <w:r>
-              <w:rPr>
-                <w:rFonts w:ascii="宋体" w:hAnsi="宋体" w:eastAsia="宋体"/>
-                <w:sz w:val="18"/>
-              </w:rPr>
               <w:t>游戏时长（h）</w:t>
             </w:r>
           </w:p>
@@ -1798,15 +1801,8 @@
             <w:vAlign w:val="center"/>
           </w:tcPr>
           <w:p>
-            <w:pPr>
-              <w:jc w:val="both"/>
-            </w:pPr>
-            <w:r>
-              <w:rPr>
-                <w:rFonts w:ascii="宋体" w:hAnsi="宋体" w:eastAsia="宋体"/>
-                <w:sz w:val="18"/>
-              </w:rPr>
-              <w:t>其他</w:t>
+            <w:r>
+              <w:t>策划视角</w:t>
             </w:r>
           </w:p>
         </w:tc>
@@ -1846,7 +1842,7 @@
                 <w:rFonts w:ascii="宋体" w:hAnsi="宋体" w:eastAsia="宋体"/>
                 <w:sz w:val="18"/>
               </w:rPr>
-              <w:t>移动端</w:t>
+              <w:t>沙盒建造</w:t>
             </w:r>
           </w:p>
         </w:tc>
@@ -1864,7 +1860,7 @@
                 <w:rFonts w:ascii="宋体" w:hAnsi="宋体" w:eastAsia="宋体"/>
                 <w:sz w:val="18"/>
               </w:rPr>
-              <w:t>沙盒建造</w:t>
+              <w:t>我的世界（手游版）</w:t>
             </w:r>
           </w:p>
         </w:tc>
@@ -1882,24 +1878,6 @@
                 <w:rFonts w:ascii="宋体" w:hAnsi="宋体" w:eastAsia="宋体"/>
                 <w:sz w:val="18"/>
               </w:rPr>
-              <w:t>我的世界（手游版）</w:t>
-            </w:r>
-          </w:p>
-        </w:tc>
-        <w:tc>
-          <w:tcPr>
-            <w:tcW w:w="1626" w:type="dxa"/>
-            <w:vAlign w:val="center"/>
-          </w:tcPr>
-          <w:p>
-            <w:pPr>
-              <w:jc w:val="both"/>
-            </w:pPr>
-            <w:r>
-              <w:rPr>
-                <w:rFonts w:ascii="宋体" w:hAnsi="宋体" w:eastAsia="宋体"/>
-                <w:sz w:val="18"/>
-              </w:rPr>
               <w:t>2025</w:t>
             </w:r>
           </w:p>
@@ -1928,15 +1906,8 @@
             <w:vAlign w:val="center"/>
           </w:tcPr>
           <w:p>
-            <w:pPr>
-              <w:jc w:val="both"/>
-            </w:pPr>
-            <w:r>
-              <w:rPr>
-                <w:rFonts w:ascii="宋体" w:hAnsi="宋体" w:eastAsia="宋体"/>
-                <w:sz w:val="18"/>
-              </w:rPr>
-              <w:t>长线养成型消费</w:t>
+            <w:r>
+              <w:t>长期研究方块逻辑与红石机关，观察长线系统构建与象征性消费设计</w:t>
             </w:r>
           </w:p>
         </w:tc>
@@ -1976,7 +1947,7 @@
                 <w:rFonts w:ascii="宋体" w:hAnsi="宋体" w:eastAsia="宋体"/>
                 <w:sz w:val="18"/>
               </w:rPr>
-              <w:t>PC端</w:t>
+              <w:t>MOBA</w:t>
             </w:r>
           </w:p>
         </w:tc>
@@ -1994,7 +1965,7 @@
                 <w:rFonts w:ascii="宋体" w:hAnsi="宋体" w:eastAsia="宋体"/>
                 <w:sz w:val="18"/>
               </w:rPr>
-              <w:t>MOBA</w:t>
+              <w:t>英雄联盟</w:t>
             </w:r>
           </w:p>
         </w:tc>
@@ -2012,24 +1983,6 @@
                 <w:rFonts w:ascii="宋体" w:hAnsi="宋体" w:eastAsia="宋体"/>
                 <w:sz w:val="18"/>
               </w:rPr>
-              <w:t>英雄联盟</w:t>
-            </w:r>
-          </w:p>
-        </w:tc>
-        <w:tc>
-          <w:tcPr>
-            <w:tcW w:w="1626" w:type="dxa"/>
-            <w:vAlign w:val="center"/>
-          </w:tcPr>
-          <w:p>
-            <w:pPr>
-              <w:jc w:val="both"/>
-            </w:pPr>
-            <w:r>
-              <w:rPr>
-                <w:rFonts w:ascii="宋体" w:hAnsi="宋体" w:eastAsia="宋体"/>
-                <w:sz w:val="18"/>
-              </w:rPr>
               <w:t>10000+</w:t>
             </w:r>
           </w:p>
@@ -2058,15 +2011,8 @@
             <w:vAlign w:val="center"/>
           </w:tcPr>
           <w:p>
-            <w:pPr>
-              <w:jc w:val="both"/>
-            </w:pPr>
-            <w:r>
-              <w:rPr>
-                <w:rFonts w:ascii="宋体" w:hAnsi="宋体" w:eastAsia="宋体"/>
-                <w:sz w:val="18"/>
-              </w:rPr>
-              <w:t>—</w:t>
+            <w:r>
+              <w:t>长线运营范本，持续关注英雄数值平衡与赛季系统迭代</w:t>
             </w:r>
           </w:p>
         </w:tc>
@@ -2106,7 +2052,7 @@
                 <w:rFonts w:ascii="宋体" w:hAnsi="宋体" w:eastAsia="宋体"/>
                 <w:sz w:val="18"/>
               </w:rPr>
-              <w:t>PC端</w:t>
+              <w:t>战术射击</w:t>
             </w:r>
           </w:p>
         </w:tc>
@@ -2124,7 +2070,7 @@
                 <w:rFonts w:ascii="宋体" w:hAnsi="宋体" w:eastAsia="宋体"/>
                 <w:sz w:val="18"/>
               </w:rPr>
-              <w:t>战术射击</w:t>
+              <w:t>无畏契约</w:t>
             </w:r>
           </w:p>
         </w:tc>
@@ -2142,24 +2088,6 @@
                 <w:rFonts w:ascii="宋体" w:hAnsi="宋体" w:eastAsia="宋体"/>
                 <w:sz w:val="18"/>
               </w:rPr>
-              <w:t>无畏契约</w:t>
-            </w:r>
-          </w:p>
-        </w:tc>
-        <w:tc>
-          <w:tcPr>
-            <w:tcW w:w="1626" w:type="dxa"/>
-            <w:vAlign w:val="center"/>
-          </w:tcPr>
-          <w:p>
-            <w:pPr>
-              <w:jc w:val="both"/>
-            </w:pPr>
-            <w:r>
-              <w:rPr>
-                <w:rFonts w:ascii="宋体" w:hAnsi="宋体" w:eastAsia="宋体"/>
-                <w:sz w:val="18"/>
-              </w:rPr>
               <w:t>2000+</w:t>
             </w:r>
           </w:p>
@@ -2188,15 +2116,8 @@
             <w:vAlign w:val="center"/>
           </w:tcPr>
           <w:p>
-            <w:pPr>
-              <w:jc w:val="both"/>
-            </w:pPr>
-            <w:r>
-              <w:rPr>
-                <w:rFonts w:ascii="宋体" w:hAnsi="宋体" w:eastAsia="宋体"/>
-                <w:sz w:val="18"/>
-              </w:rPr>
-              <w:t>—</w:t>
+            <w:r>
+              <w:t>战术射击的段位验证循环与角色解锁节奏</w:t>
             </w:r>
           </w:p>
         </w:tc>
@@ -2236,7 +2157,7 @@
                 <w:rFonts w:ascii="宋体" w:hAnsi="宋体" w:eastAsia="宋体"/>
                 <w:sz w:val="18"/>
               </w:rPr>
-              <w:t>PC端</w:t>
+              <w:t>肉鸽合作动作</w:t>
             </w:r>
           </w:p>
         </w:tc>
@@ -2254,7 +2175,7 @@
                 <w:rFonts w:ascii="宋体" w:hAnsi="宋体" w:eastAsia="宋体"/>
                 <w:sz w:val="18"/>
               </w:rPr>
-              <w:t>肉鸽合作动作</w:t>
+              <w:t>艾尔登法环：黑夜君临</w:t>
             </w:r>
           </w:p>
         </w:tc>
@@ -2272,24 +2193,6 @@
                 <w:rFonts w:ascii="宋体" w:hAnsi="宋体" w:eastAsia="宋体"/>
                 <w:sz w:val="18"/>
               </w:rPr>
-              <w:t>艾尔登法环：黑夜君临</w:t>
-            </w:r>
-          </w:p>
-        </w:tc>
-        <w:tc>
-          <w:tcPr>
-            <w:tcW w:w="1626" w:type="dxa"/>
-            <w:vAlign w:val="center"/>
-          </w:tcPr>
-          <w:p>
-            <w:pPr>
-              <w:jc w:val="both"/>
-            </w:pPr>
-            <w:r>
-              <w:rPr>
-                <w:rFonts w:ascii="宋体" w:hAnsi="宋体" w:eastAsia="宋体"/>
-                <w:sz w:val="18"/>
-              </w:rPr>
               <w:t>1000+</w:t>
             </w:r>
           </w:p>
@@ -2318,15 +2221,8 @@
             <w:vAlign w:val="center"/>
           </w:tcPr>
           <w:p>
-            <w:pPr>
-              <w:jc w:val="both"/>
-            </w:pPr>
-            <w:r>
-              <w:rPr>
-                <w:rFonts w:ascii="宋体" w:hAnsi="宋体" w:eastAsia="宋体"/>
-                <w:sz w:val="18"/>
-              </w:rPr>
-              <w:t>—</w:t>
+            <w:r>
+              <w:t>局内随机构建与局外成长分离的共斗肉鸽设计</w:t>
             </w:r>
           </w:p>
         </w:tc>
@@ -2366,7 +2262,7 @@
                 <w:rFonts w:ascii="宋体" w:hAnsi="宋体" w:eastAsia="宋体"/>
                 <w:sz w:val="18"/>
               </w:rPr>
-              <w:t>移动端</w:t>
+              <w:t>回合制RPG</w:t>
             </w:r>
           </w:p>
         </w:tc>
@@ -2384,7 +2280,7 @@
                 <w:rFonts w:ascii="宋体" w:hAnsi="宋体" w:eastAsia="宋体"/>
                 <w:sz w:val="18"/>
               </w:rPr>
-              <w:t>回合制RPG</w:t>
+              <w:t>第七史诗</w:t>
             </w:r>
           </w:p>
         </w:tc>
@@ -2402,24 +2298,6 @@
                 <w:rFonts w:ascii="宋体" w:hAnsi="宋体" w:eastAsia="宋体"/>
                 <w:sz w:val="18"/>
               </w:rPr>
-              <w:t>第七史诗</w:t>
-            </w:r>
-          </w:p>
-        </w:tc>
-        <w:tc>
-          <w:tcPr>
-            <w:tcW w:w="1626" w:type="dxa"/>
-            <w:vAlign w:val="center"/>
-          </w:tcPr>
-          <w:p>
-            <w:pPr>
-              <w:jc w:val="both"/>
-            </w:pPr>
-            <w:r>
-              <w:rPr>
-                <w:rFonts w:ascii="宋体" w:hAnsi="宋体" w:eastAsia="宋体"/>
-                <w:sz w:val="18"/>
-              </w:rPr>
               <w:t>约680</w:t>
             </w:r>
           </w:p>
@@ -2448,15 +2326,8 @@
             <w:vAlign w:val="center"/>
           </w:tcPr>
           <w:p>
-            <w:pPr>
-              <w:jc w:val="both"/>
-            </w:pPr>
-            <w:r>
-              <w:rPr>
-                <w:rFonts w:ascii="宋体" w:hAnsi="宋体" w:eastAsia="宋体"/>
-                <w:sz w:val="18"/>
-              </w:rPr>
-              <w:t>中度氪金</w:t>
+            <w:r>
+              <w:t>装备词条随机与保底毕业节奏，长线养成的产出控制样本</w:t>
             </w:r>
           </w:p>
         </w:tc>
@@ -2494,7 +2365,7 @@
                 <w:rFonts w:ascii="宋体" w:hAnsi="宋体" w:eastAsia="宋体"/>
                 <w:sz w:val="18"/>
               </w:rPr>
-              <w:t>PC端</w:t>
+              <w:t>卡牌策略</w:t>
             </w:r>
           </w:p>
         </w:tc>
@@ -2511,7 +2382,7 @@
                 <w:rFonts w:ascii="宋体" w:hAnsi="宋体" w:eastAsia="宋体"/>
                 <w:sz w:val="18"/>
               </w:rPr>
-              <w:t>卡牌策略</w:t>
+              <w:t>炉石传说</w:t>
             </w:r>
           </w:p>
         </w:tc>
@@ -2528,13 +2399,13 @@
                 <w:rFonts w:ascii="宋体" w:hAnsi="宋体" w:eastAsia="宋体"/>
                 <w:sz w:val="18"/>
               </w:rPr>
-              <w:t>炉石传说</w:t>
-            </w:r>
-          </w:p>
-        </w:tc>
-        <w:tc>
-          <w:tcPr>
-            <w:tcW w:w="1626" w:type="dxa"/>
+              <w:t>759</w:t>
+            </w:r>
+          </w:p>
+        </w:tc>
+        <w:tc>
+          <w:tcPr>
+            <w:tcW w:w="1627" w:type="dxa"/>
           </w:tcPr>
           <w:p>
             <w:pPr>
@@ -2545,7 +2416,7 @@
                 <w:rFonts w:ascii="宋体" w:hAnsi="宋体" w:eastAsia="宋体"/>
                 <w:sz w:val="18"/>
               </w:rPr>
-              <w:t>759</w:t>
+              <w:t>多赛季天梯</w:t>
             </w:r>
           </w:p>
         </w:tc>
@@ -2554,32 +2425,8 @@
             <w:tcW w:w="1627" w:type="dxa"/>
           </w:tcPr>
           <w:p>
-            <w:pPr>
-              <w:jc w:val="both"/>
-            </w:pPr>
-            <w:r>
-              <w:rPr>
-                <w:rFonts w:ascii="宋体" w:hAnsi="宋体" w:eastAsia="宋体"/>
-                <w:sz w:val="18"/>
-              </w:rPr>
-              <w:t>多赛季天梯</w:t>
-            </w:r>
-          </w:p>
-        </w:tc>
-        <w:tc>
-          <w:tcPr>
-            <w:tcW w:w="1627" w:type="dxa"/>
-          </w:tcPr>
-          <w:p>
-            <w:pPr>
-              <w:jc w:val="both"/>
-            </w:pPr>
-            <w:r>
-              <w:rPr>
-                <w:rFonts w:ascii="宋体" w:hAnsi="宋体" w:eastAsia="宋体"/>
-                <w:sz w:val="18"/>
-              </w:rPr>
-              <w:t>—</w:t>
+            <w:r>
+              <w:t>卡牌经济的开包概率公示与资源分解循环</w:t>
             </w:r>
           </w:p>
         </w:tc>
@@ -2617,7 +2464,7 @@
                 <w:rFonts w:ascii="宋体" w:hAnsi="宋体" w:eastAsia="宋体"/>
                 <w:sz w:val="18"/>
               </w:rPr>
-              <w:t>移动端</w:t>
+              <w:t>策略SLG</w:t>
             </w:r>
           </w:p>
         </w:tc>
@@ -2634,7 +2481,7 @@
                 <w:rFonts w:ascii="宋体" w:hAnsi="宋体" w:eastAsia="宋体"/>
                 <w:sz w:val="18"/>
               </w:rPr>
-              <w:t>策略SLG</w:t>
+              <w:t>率土之滨</w:t>
             </w:r>
           </w:p>
         </w:tc>
@@ -2651,13 +2498,13 @@
                 <w:rFonts w:ascii="宋体" w:hAnsi="宋体" w:eastAsia="宋体"/>
                 <w:sz w:val="18"/>
               </w:rPr>
-              <w:t>率土之滨</w:t>
-            </w:r>
-          </w:p>
-        </w:tc>
-        <w:tc>
-          <w:tcPr>
-            <w:tcW w:w="1626" w:type="dxa"/>
+              <w:t>271</w:t>
+            </w:r>
+          </w:p>
+        </w:tc>
+        <w:tc>
+          <w:tcPr>
+            <w:tcW w:w="1627" w:type="dxa"/>
           </w:tcPr>
           <w:p>
             <w:pPr>
@@ -2668,7 +2515,7 @@
                 <w:rFonts w:ascii="宋体" w:hAnsi="宋体" w:eastAsia="宋体"/>
                 <w:sz w:val="18"/>
               </w:rPr>
-              <w:t>271</w:t>
+              <w:t>赛季制联盟作战</w:t>
             </w:r>
           </w:p>
         </w:tc>
@@ -2677,32 +2524,8 @@
             <w:tcW w:w="1627" w:type="dxa"/>
           </w:tcPr>
           <w:p>
-            <w:pPr>
-              <w:jc w:val="both"/>
-            </w:pPr>
-            <w:r>
-              <w:rPr>
-                <w:rFonts w:ascii="宋体" w:hAnsi="宋体" w:eastAsia="宋体"/>
-                <w:sz w:val="18"/>
-              </w:rPr>
-              <w:t>赛季制联盟作战</w:t>
-            </w:r>
-          </w:p>
-        </w:tc>
-        <w:tc>
-          <w:tcPr>
-            <w:tcW w:w="1627" w:type="dxa"/>
-          </w:tcPr>
-          <w:p>
-            <w:pPr>
-              <w:jc w:val="both"/>
-            </w:pPr>
-            <w:r>
-              <w:rPr>
-                <w:rFonts w:ascii="宋体" w:hAnsi="宋体" w:eastAsia="宋体"/>
-                <w:sz w:val="18"/>
-              </w:rPr>
-              <w:t>轻度氪金</w:t>
+            <w:r>
+              <w:t>SLG 赛季制重置与联盟协作的付费结构</w:t>
             </w:r>
           </w:p>
         </w:tc>
@@ -2740,7 +2563,7 @@
                 <w:rFonts w:ascii="宋体" w:hAnsi="宋体" w:eastAsia="宋体"/>
                 <w:sz w:val="18"/>
               </w:rPr>
-              <w:t>移动端</w:t>
+              <w:t>开放世界RPG</w:t>
             </w:r>
           </w:p>
         </w:tc>
@@ -2757,7 +2580,7 @@
                 <w:rFonts w:ascii="宋体" w:hAnsi="宋体" w:eastAsia="宋体"/>
                 <w:sz w:val="18"/>
               </w:rPr>
-              <w:t>开放世界RPG</w:t>
+              <w:t>原神</w:t>
             </w:r>
           </w:p>
         </w:tc>
@@ -2774,13 +2597,13 @@
                 <w:rFonts w:ascii="宋体" w:hAnsi="宋体" w:eastAsia="宋体"/>
                 <w:sz w:val="18"/>
               </w:rPr>
-              <w:t>原神</w:t>
-            </w:r>
-          </w:p>
-        </w:tc>
-        <w:tc>
-          <w:tcPr>
-            <w:tcW w:w="1626" w:type="dxa"/>
+              <w:t>353</w:t>
+            </w:r>
+          </w:p>
+        </w:tc>
+        <w:tc>
+          <w:tcPr>
+            <w:tcW w:w="1627" w:type="dxa"/>
           </w:tcPr>
           <w:p>
             <w:pPr>
@@ -2791,7 +2614,7 @@
                 <w:rFonts w:ascii="宋体" w:hAnsi="宋体" w:eastAsia="宋体"/>
                 <w:sz w:val="18"/>
               </w:rPr>
-              <w:t>353</w:t>
+              <w:t>须弥主线推进</w:t>
             </w:r>
           </w:p>
         </w:tc>
@@ -2800,32 +2623,8 @@
             <w:tcW w:w="1627" w:type="dxa"/>
           </w:tcPr>
           <w:p>
-            <w:pPr>
-              <w:jc w:val="both"/>
-            </w:pPr>
-            <w:r>
-              <w:rPr>
-                <w:rFonts w:ascii="宋体" w:hAnsi="宋体" w:eastAsia="宋体"/>
-                <w:sz w:val="18"/>
-              </w:rPr>
-              <w:t>须弥主线推进</w:t>
-            </w:r>
-          </w:p>
-        </w:tc>
-        <w:tc>
-          <w:tcPr>
-            <w:tcW w:w="1627" w:type="dxa"/>
-          </w:tcPr>
-          <w:p>
-            <w:pPr>
-              <w:jc w:val="both"/>
-            </w:pPr>
-            <w:r>
-              <w:rPr>
-                <w:rFonts w:ascii="宋体" w:hAnsi="宋体" w:eastAsia="宋体"/>
-                <w:sz w:val="18"/>
-              </w:rPr>
-              <w:t>轻度氪金</w:t>
+            <w:r>
+              <w:t>开放世界探索驱动抽卡动机的内容设计范式</w:t>
             </w:r>
           </w:p>
         </w:tc>
@@ -2863,7 +2662,7 @@
                 <w:rFonts w:ascii="宋体" w:hAnsi="宋体" w:eastAsia="宋体"/>
                 <w:sz w:val="19"/>
               </w:rPr>
-              <w:t>PC端</w:t>
+              <w:t>模拟经营</w:t>
             </w:r>
           </w:p>
         </w:tc>
@@ -2880,7 +2679,7 @@
                 <w:rFonts w:ascii="宋体" w:hAnsi="宋体" w:eastAsia="宋体"/>
                 <w:sz w:val="19"/>
               </w:rPr>
-              <w:t>模拟经营</w:t>
+              <w:t>星露谷物语</w:t>
             </w:r>
           </w:p>
         </w:tc>
@@ -2897,13 +2696,13 @@
                 <w:rFonts w:ascii="宋体" w:hAnsi="宋体" w:eastAsia="宋体"/>
                 <w:sz w:val="19"/>
               </w:rPr>
-              <w:t>星露谷物语</w:t>
-            </w:r>
-          </w:p>
-        </w:tc>
-        <w:tc>
-          <w:tcPr>
-            <w:tcW w:w="1626" w:type="dxa"/>
+              <w:t>100+</w:t>
+            </w:r>
+          </w:p>
+        </w:tc>
+        <w:tc>
+          <w:tcPr>
+            <w:tcW w:w="1627" w:type="dxa"/>
           </w:tcPr>
           <w:p>
             <w:pPr>
@@ -2914,7 +2713,7 @@
                 <w:rFonts w:ascii="宋体" w:hAnsi="宋体" w:eastAsia="宋体"/>
                 <w:sz w:val="19"/>
               </w:rPr>
-              <w:t>100+</w:t>
+              <w:t>农场全季经营与产销链规划</w:t>
             </w:r>
           </w:p>
         </w:tc>
@@ -2923,32 +2722,8 @@
             <w:tcW w:w="1627" w:type="dxa"/>
           </w:tcPr>
           <w:p>
-            <w:pPr>
-              <w:jc w:val="both"/>
-            </w:pPr>
-            <w:r>
-              <w:rPr>
-                <w:rFonts w:ascii="宋体" w:hAnsi="宋体" w:eastAsia="宋体"/>
-                <w:sz w:val="19"/>
-              </w:rPr>
-              <w:t>农场全季经营与产销链规划</w:t>
-            </w:r>
-          </w:p>
-        </w:tc>
-        <w:tc>
-          <w:tcPr>
-            <w:tcW w:w="1627" w:type="dxa"/>
-          </w:tcPr>
-          <w:p>
-            <w:pPr>
-              <w:jc w:val="both"/>
-            </w:pPr>
-            <w:r>
-              <w:rPr>
-                <w:rFonts w:ascii="宋体" w:hAnsi="宋体" w:eastAsia="宋体"/>
-                <w:sz w:val="19"/>
-              </w:rPr>
-              <w:t>—</w:t>
+            <w:r>
+              <w:t>单品产销链与季节节奏的轻量化经济循环</w:t>
             </w:r>
           </w:p>
         </w:tc>
@@ -2986,7 +2761,7 @@
                 <w:rFonts w:ascii="宋体" w:hAnsi="宋体" w:eastAsia="宋体"/>
                 <w:sz w:val="19"/>
               </w:rPr>
-              <w:t>PC端</w:t>
+              <w:t>生存建造</w:t>
             </w:r>
           </w:p>
         </w:tc>
@@ -3003,7 +2778,7 @@
                 <w:rFonts w:ascii="宋体" w:hAnsi="宋体" w:eastAsia="宋体"/>
                 <w:sz w:val="19"/>
               </w:rPr>
-              <w:t>生存建造</w:t>
+              <w:t>英灵神殿</w:t>
             </w:r>
           </w:p>
         </w:tc>
@@ -3020,13 +2795,13 @@
                 <w:rFonts w:ascii="宋体" w:hAnsi="宋体" w:eastAsia="宋体"/>
                 <w:sz w:val="19"/>
               </w:rPr>
-              <w:t>英灵神殿</w:t>
-            </w:r>
-          </w:p>
-        </w:tc>
-        <w:tc>
-          <w:tcPr>
-            <w:tcW w:w="1626" w:type="dxa"/>
+              <w:t>100+</w:t>
+            </w:r>
+          </w:p>
+        </w:tc>
+        <w:tc>
+          <w:tcPr>
+            <w:tcW w:w="1627" w:type="dxa"/>
           </w:tcPr>
           <w:p>
             <w:pPr>
@@ -3037,7 +2812,7 @@
                 <w:rFonts w:ascii="宋体" w:hAnsi="宋体" w:eastAsia="宋体"/>
                 <w:sz w:val="19"/>
               </w:rPr>
-              <w:t>100+</w:t>
+              <w:t>长期生存档，航海与据点建设</w:t>
             </w:r>
           </w:p>
         </w:tc>
@@ -3046,32 +2821,8 @@
             <w:tcW w:w="1627" w:type="dxa"/>
           </w:tcPr>
           <w:p>
-            <w:pPr>
-              <w:jc w:val="both"/>
-            </w:pPr>
-            <w:r>
-              <w:rPr>
-                <w:rFonts w:ascii="宋体" w:hAnsi="宋体" w:eastAsia="宋体"/>
-                <w:sz w:val="19"/>
-              </w:rPr>
-              <w:t>长期生存档，航海与据点建设</w:t>
-            </w:r>
-          </w:p>
-        </w:tc>
-        <w:tc>
-          <w:tcPr>
-            <w:tcW w:w="1627" w:type="dxa"/>
-          </w:tcPr>
-          <w:p>
-            <w:pPr>
-              <w:jc w:val="both"/>
-            </w:pPr>
-            <w:r>
-              <w:rPr>
-                <w:rFonts w:ascii="宋体" w:hAnsi="宋体" w:eastAsia="宋体"/>
-                <w:sz w:val="19"/>
-              </w:rPr>
-              <w:t>—</w:t>
+            <w:r>
+              <w:t>生存建造的材料门槛与进度控制设计</w:t>
             </w:r>
           </w:p>
         </w:tc>
@@ -3109,7 +2860,7 @@
                 <w:rFonts w:ascii="宋体" w:hAnsi="宋体" w:eastAsia="宋体"/>
                 <w:sz w:val="19"/>
               </w:rPr>
-              <w:t>PC端</w:t>
+              <w:t>写实拟真</w:t>
             </w:r>
           </w:p>
         </w:tc>
@@ -3126,7 +2877,7 @@
                 <w:rFonts w:ascii="宋体" w:hAnsi="宋体" w:eastAsia="宋体"/>
                 <w:sz w:val="19"/>
               </w:rPr>
-              <w:t>写实拟真</w:t>
+              <w:t>GTA5</w:t>
             </w:r>
           </w:p>
         </w:tc>
@@ -3143,13 +2894,13 @@
                 <w:rFonts w:ascii="宋体" w:hAnsi="宋体" w:eastAsia="宋体"/>
                 <w:sz w:val="19"/>
               </w:rPr>
-              <w:t>GTA5</w:t>
-            </w:r>
-          </w:p>
-        </w:tc>
-        <w:tc>
-          <w:tcPr>
-            <w:tcW w:w="1626" w:type="dxa"/>
+              <w:t>500+</w:t>
+            </w:r>
+          </w:p>
+        </w:tc>
+        <w:tc>
+          <w:tcPr>
+            <w:tcW w:w="1627" w:type="dxa"/>
           </w:tcPr>
           <w:p>
             <w:pPr>
@@ -3160,7 +2911,7 @@
                 <w:rFonts w:ascii="宋体" w:hAnsi="宋体" w:eastAsia="宋体"/>
                 <w:sz w:val="19"/>
               </w:rPr>
-              <w:t>500+</w:t>
+              <w:t>写实开放世界沉浸体验</w:t>
             </w:r>
           </w:p>
         </w:tc>
@@ -3169,32 +2920,8 @@
             <w:tcW w:w="1627" w:type="dxa"/>
           </w:tcPr>
           <w:p>
-            <w:pPr>
-              <w:jc w:val="both"/>
-            </w:pPr>
-            <w:r>
-              <w:rPr>
-                <w:rFonts w:ascii="宋体" w:hAnsi="宋体" w:eastAsia="宋体"/>
-                <w:sz w:val="19"/>
-              </w:rPr>
-              <w:t>写实开放世界沉浸体验</w:t>
-            </w:r>
-          </w:p>
-        </w:tc>
-        <w:tc>
-          <w:tcPr>
-            <w:tcW w:w="1627" w:type="dxa"/>
-          </w:tcPr>
-          <w:p>
-            <w:pPr>
-              <w:jc w:val="both"/>
-            </w:pPr>
-            <w:r>
-              <w:rPr>
-                <w:rFonts w:ascii="宋体" w:hAnsi="宋体" w:eastAsia="宋体"/>
-                <w:sz w:val="19"/>
-              </w:rPr>
-              <w:t>—</w:t>
+            <w:r>
+              <w:t>写实开放世界的沉浸式内容投放密度</w:t>
             </w:r>
           </w:p>
         </w:tc>
@@ -3438,7 +3165,7 @@
             </w14:solidFill>
           </w14:textFill>
         </w:rPr>
-        <w:t>个性化：生存建造类深度玩家（我的世界累计 2700 小时），偏爱长线经营与系统构建类内容，喜欢研究「系统为什么这么设计」。</w:t>
+        <w:t>个性化：生存建造类深度玩家（我的世界累计 2700 小时），偏爱长线经营与系统构建，习惯把偏好转化为拆解视角，已独立输出多份系统拆解作品。</w:t>
       </w:r>
     </w:p>
     <w:p>
@@ -3465,18 +3192,15 @@
       </w:pPr>
       <w:r>
         <w:rPr>
-          <w:rFonts w:hint="eastAsia"/>
-          <w:color w:val="000000" w:themeColor="text1"/>
-          <w:sz w:val="18"/>
-          <w:szCs w:val="18"/>
-          <w:lang w:val="en-US" w:eastAsia="zh-CN"/>
-          <w14:textFill>
-            <w14:solidFill>
-              <w14:schemeClr w14:val="tx1"/>
-            </w14:solidFill>
-          </w14:textFill>
-        </w:rPr>
-        <w:t>执行力与抗压：独立完成四份长篇作品集文档，从选题、数据核查到排版全流程自主交付，多线任务下按期出稿。</w:t>
+          <w:b/>
+        </w:rPr>
+        <w:t>复合能力：</w:t>
+      </w:r>
+      <w:r>
+        <w:rPr>
+          <w:b w:val="0"/>
+        </w:rPr>
+        <w:t>策划（4 份长篇拆解 / 策划案）+ 程序（Python 数据脚本、Unity 原型搭建）+ AI 工作流（文档生成、界面示意图与流程图绘制）三线协同，从选题、数据核查到排版全流程自主交付，多线任务下按期出稿。</w:t>
       </w:r>
     </w:p>
     <w:p>

</xml_diff>